<commit_message>
tratamento de pessoas e ajuste na estrutura do projeto
</commit_message>
<xml_diff>
--- a/Documentacao/mig_kairos_cigam_NAO_OFICIAL.docx
+++ b/Documentacao/mig_kairos_cigam_NAO_OFICIAL.docx
@@ -9,7 +9,15 @@
     </w:p>
     <w:p>
       <w:r>
-        <w:t xml:space="preserve">Gabriel Angelo </w:t>
+        <w:t xml:space="preserve">Gabriel </w:t>
+      </w:r>
+      <w:proofErr w:type="spellStart"/>
+      <w:r>
+        <w:t>Angelo</w:t>
+      </w:r>
+      <w:proofErr w:type="spellEnd"/>
+      <w:r>
+        <w:t xml:space="preserve"> </w:t>
       </w:r>
       <w:r>
         <w:t>–</w:t>
@@ -26,8 +34,13 @@
     <w:p/>
     <w:p>
       <w:r>
-        <w:t>- Exemplo de chamado na API do Kairos</w:t>
-      </w:r>
+        <w:t xml:space="preserve">- Exemplo de chamado na API do </w:t>
+      </w:r>
+      <w:proofErr w:type="spellStart"/>
+      <w:r>
+        <w:t>Kairos</w:t>
+      </w:r>
+      <w:proofErr w:type="spellEnd"/>
     </w:p>
     <w:p>
       <w:r>
@@ -130,7 +143,23 @@
     <w:p/>
     <w:p>
       <w:r>
-        <w:t>- tudo começa com o responsável baixando o arquivo no kairos que vem no seguinte formato:</w:t>
+        <w:t xml:space="preserve">- </w:t>
+      </w:r>
+      <w:proofErr w:type="gramStart"/>
+      <w:r>
+        <w:t>tudo</w:t>
+      </w:r>
+      <w:proofErr w:type="gramEnd"/>
+      <w:r>
+        <w:t xml:space="preserve"> começa com o responsável baixando o arquivo no </w:t>
+      </w:r>
+      <w:proofErr w:type="spellStart"/>
+      <w:r>
+        <w:t>kairos</w:t>
+      </w:r>
+      <w:proofErr w:type="spellEnd"/>
+      <w:r>
+        <w:t xml:space="preserve"> que vem no seguinte formato:</w:t>
       </w:r>
     </w:p>
     <w:p/>
@@ -193,7 +222,15 @@
         <w:t xml:space="preserve">(“DE - ATÉ”) </w:t>
       </w:r>
       <w:r>
-        <w:t>+ data e hora de criação do arquivo) representa 1 batimento de ponto de um determinado colab.</w:t>
+        <w:t xml:space="preserve">+ data e hora de criação do arquivo) representa 1 batimento de ponto de um determinado </w:t>
+      </w:r>
+      <w:proofErr w:type="spellStart"/>
+      <w:r>
+        <w:t>colab</w:t>
+      </w:r>
+      <w:proofErr w:type="spellEnd"/>
+      <w:r>
+        <w:t>.</w:t>
       </w:r>
     </w:p>
     <w:p/>
@@ -212,7 +249,17 @@
         <w:t xml:space="preserve">concatenado e </w:t>
       </w:r>
       <w:r>
-        <w:t>padrão entre cada batimento, que se da por:</w:t>
+        <w:t xml:space="preserve">padrão entre cada batimento, que se </w:t>
+      </w:r>
+      <w:proofErr w:type="spellStart"/>
+      <w:proofErr w:type="gramStart"/>
+      <w:r>
+        <w:t>da</w:t>
+      </w:r>
+      <w:proofErr w:type="spellEnd"/>
+      <w:proofErr w:type="gramEnd"/>
+      <w:r>
+        <w:t xml:space="preserve"> por:</w:t>
       </w:r>
     </w:p>
     <w:p>
@@ -246,308 +293,372 @@
     </w:p>
     <w:p/>
     <w:p>
-      <w:pPr>
-        <w:pStyle w:val="PargrafodaLista"/>
-        <w:numPr>
-          <w:ilvl w:val="0"/>
-          <w:numId w:val="2"/>
-        </w:numPr>
-      </w:pPr>
-      <w:r>
-        <w:t>Código (ainda inexplicado</w:t>
-      </w:r>
-      <w:r>
-        <w:t>. Se atentar ao começo ’00+código de 3 números’ que pode simbolizar alguma coisa</w:t>
+      <w:r>
+        <w:t>•</w:t>
+      </w:r>
+      <w:r>
+        <w:tab/>
+        <w:t>Código (Id de apontamento [“</w:t>
+      </w:r>
+      <w:proofErr w:type="spellStart"/>
+      <w:r>
+        <w:t>IdApont</w:t>
+      </w:r>
+      <w:proofErr w:type="spellEnd"/>
+      <w:r>
+        <w:t>”] com preenchimento a esquerda de 2 algarismos preenchido com “0”, totalizando 9 caracteres)</w:t>
+      </w:r>
+    </w:p>
+    <w:p>
+      <w:r>
+        <w:t>•</w:t>
+      </w:r>
+      <w:r>
+        <w:tab/>
+        <w:t xml:space="preserve">+ “7” (valor padrão testado para 4 pessoas – 3 da mesma área e </w:t>
+      </w:r>
+      <w:proofErr w:type="gramStart"/>
+      <w:r>
+        <w:t>1 )</w:t>
+      </w:r>
+      <w:proofErr w:type="gramEnd"/>
+      <w:r>
+        <w:t xml:space="preserve"> </w:t>
+      </w:r>
+    </w:p>
+    <w:p>
+      <w:r>
+        <w:t>•</w:t>
+      </w:r>
+      <w:r>
+        <w:tab/>
+        <w:t xml:space="preserve">+ Data e Hora do batimento sem análise de segundos (estão separados por um ‘T’) </w:t>
+      </w:r>
+    </w:p>
+    <w:p>
+      <w:r>
+        <w:t>•</w:t>
+      </w:r>
+      <w:r>
+        <w:tab/>
+        <w:t>+ ‘-’ (hífen)</w:t>
+      </w:r>
+    </w:p>
+    <w:p>
+      <w:r>
+        <w:t>•</w:t>
+      </w:r>
+      <w:r>
+        <w:tab/>
+        <w:t xml:space="preserve">+ ‘0300’ (ainda inexplicado) </w:t>
+      </w:r>
+    </w:p>
+    <w:p>
+      <w:r>
+        <w:t>•</w:t>
+      </w:r>
+      <w:r>
+        <w:tab/>
+        <w:t xml:space="preserve">+ CPF do </w:t>
+      </w:r>
+      <w:proofErr w:type="spellStart"/>
+      <w:r>
+        <w:t>colab</w:t>
+      </w:r>
+      <w:proofErr w:type="spellEnd"/>
+      <w:r>
+        <w:t xml:space="preserve">. (PJ não bate ponto) </w:t>
+      </w:r>
+    </w:p>
+    <w:p>
+      <w:r>
+        <w:t>•</w:t>
+      </w:r>
+      <w:r>
+        <w:tab/>
+        <w:t xml:space="preserve">+ </w:t>
+      </w:r>
+      <w:proofErr w:type="gramStart"/>
+      <w:r>
+        <w:t>‘ ’</w:t>
+      </w:r>
+      <w:proofErr w:type="gramEnd"/>
+      <w:r>
+        <w:t xml:space="preserve"> (espaço em branco) </w:t>
+      </w:r>
+    </w:p>
+    <w:p>
+      <w:r>
+        <w:t>•</w:t>
+      </w:r>
+      <w:r>
+        <w:tab/>
+        <w:t xml:space="preserve">+ </w:t>
+      </w:r>
+      <w:proofErr w:type="gramStart"/>
+      <w:r>
+        <w:t>A mesma</w:t>
+      </w:r>
+      <w:proofErr w:type="gramEnd"/>
+      <w:r>
+        <w:t xml:space="preserve"> Data e Hora do batimento acima, só que com a análise de segundos (também separados por ‘T’)</w:t>
+      </w:r>
+    </w:p>
+    <w:p>
+      <w:r>
+        <w:lastRenderedPageBreak/>
+        <w:t>•</w:t>
+      </w:r>
+      <w:r>
+        <w:tab/>
+        <w:t xml:space="preserve">+ ‘-’ </w:t>
+      </w:r>
+    </w:p>
+    <w:p>
+      <w:r>
+        <w:t>•</w:t>
+      </w:r>
+      <w:r>
+        <w:tab/>
+        <w:t>+ Um montante de 8 caracteres (ainda inexplicado, porém com um determinado padrão. Nos exemplos temos: 03000503 e 0300050a, mas já foi analisado outros códigos: 0300020d, 03000200, 03000206, 03000201, 03000205, 03000202, 03000208, 0300020c, 03000204, 03000207):</w:t>
+      </w:r>
+    </w:p>
+    <w:p>
+      <w:r>
+        <w:t>o</w:t>
+      </w:r>
+      <w:r>
+        <w:tab/>
+        <w:t>Minha humilde opinião é que o “03” significa algo, ‘0002’ ou ‘0005’ significam outra coisa e por final, ‘0a’, ‘03’, ‘0c’...significam outra coisa.</w:t>
+      </w:r>
+    </w:p>
+    <w:p>
+      <w:r>
+        <w:t>•</w:t>
+      </w:r>
+      <w:r>
+        <w:tab/>
+        <w:t>+ Código aleatório (ainda inexplicado)</w:t>
+      </w:r>
+    </w:p>
+    <w:p/>
+    <w:p>
+      <w:r>
+        <w:t xml:space="preserve">PROBLEMÁTICA: Há um processo interno e manual de entrar no Kairós e baixar </w:t>
+      </w:r>
+      <w:r>
+        <w:t>o arquivo</w:t>
+      </w:r>
+      <w:r>
+        <w:t xml:space="preserve"> </w:t>
+      </w:r>
+      <w:r>
+        <w:t>dentre um “</w:t>
+      </w:r>
+      <w:proofErr w:type="spellStart"/>
+      <w:r>
+        <w:t>De-Até</w:t>
+      </w:r>
+      <w:proofErr w:type="spellEnd"/>
+      <w:r>
+        <w:t xml:space="preserve">”, colocá-lo dentro de uma pasta específica onde o </w:t>
+      </w:r>
+      <w:proofErr w:type="spellStart"/>
+      <w:r>
+        <w:t>Cigam</w:t>
+      </w:r>
+      <w:proofErr w:type="spellEnd"/>
+      <w:r>
+        <w:t xml:space="preserve"> consiga ler. Após essa integração dos dados, o/a responsável tem que entrar no </w:t>
+      </w:r>
+      <w:proofErr w:type="spellStart"/>
+      <w:r>
+        <w:t>Cigam</w:t>
+      </w:r>
+      <w:proofErr w:type="spellEnd"/>
+      <w:r>
+        <w:t xml:space="preserve">, verificar os dias em que a integração não foi concluída com sucesso (caso seja verificada a necessidade), voltar no </w:t>
+      </w:r>
+      <w:proofErr w:type="spellStart"/>
+      <w:r>
+        <w:t>Kairos</w:t>
+      </w:r>
+      <w:proofErr w:type="spellEnd"/>
+      <w:r>
+        <w:t xml:space="preserve"> e identificar se possui alguma justificativa</w:t>
+      </w:r>
+      <w:r>
+        <w:t xml:space="preserve"> ou se foi apenas um atraso/irresponsabilidade do colaborador</w:t>
+      </w:r>
+      <w:r>
+        <w:t xml:space="preserve">. Caso haja, o/a responsável volta no </w:t>
+      </w:r>
+      <w:proofErr w:type="spellStart"/>
+      <w:r>
+        <w:t>Cigam</w:t>
+      </w:r>
+      <w:proofErr w:type="spellEnd"/>
+      <w:r>
+        <w:t xml:space="preserve"> e </w:t>
+      </w:r>
+      <w:r>
+        <w:t>ajusta algo (até o momento, a ação é desconhecida).</w:t>
+      </w:r>
+    </w:p>
+    <w:p/>
+    <w:p>
+      <w:r>
+        <w:t xml:space="preserve">- </w:t>
+      </w:r>
+      <w:proofErr w:type="gramStart"/>
+      <w:r>
+        <w:t>aqui</w:t>
+      </w:r>
+      <w:proofErr w:type="gramEnd"/>
+      <w:r>
+        <w:t xml:space="preserve"> </w:t>
+      </w:r>
+      <w:r>
+        <w:t xml:space="preserve">fica evidente que uma automação completa levaria um tempo considerável, então vamos em parte, e a primeira é a implantação no </w:t>
+      </w:r>
+      <w:proofErr w:type="spellStart"/>
+      <w:r>
+        <w:t>Cigam</w:t>
+      </w:r>
+      <w:proofErr w:type="spellEnd"/>
+      <w:r>
+        <w:t xml:space="preserve"> de forma automática:</w:t>
+      </w:r>
+    </w:p>
+    <w:p>
+      <w:r>
+        <w:t xml:space="preserve"> </w:t>
+      </w:r>
+    </w:p>
+    <w:p>
+      <w:r>
+        <w:t>* A</w:t>
+      </w:r>
+      <w:r>
+        <w:t xml:space="preserve"> gente tem que pegar o ponto de cada </w:t>
+      </w:r>
+      <w:r>
+        <w:t xml:space="preserve">empresa </w:t>
+      </w:r>
+      <w:r>
+        <w:t xml:space="preserve">(verificar se </w:t>
+      </w:r>
+      <w:r>
+        <w:t>existe algum ‘</w:t>
+      </w:r>
+      <w:r>
+        <w:t>ativo</w:t>
+      </w:r>
+      <w:r>
+        <w:t>’</w:t>
+      </w:r>
+      <w:r>
+        <w:t>, i</w:t>
+      </w:r>
+      <w:r>
+        <w:t>sso existe??) e buscar se em determinado dia a pessoa teve algum atraso</w:t>
+      </w:r>
+      <w:r>
+        <w:t xml:space="preserve"> (lembrar dos 10min depois de bater o ponto de entrada e depois da volta do almoço),</w:t>
+      </w:r>
+      <w:r>
+        <w:t xml:space="preserve"> justificativa e</w:t>
+      </w:r>
+      <w:r>
+        <w:t>/ou</w:t>
+      </w:r>
+      <w:r>
+        <w:t xml:space="preserve"> faltas</w:t>
+      </w:r>
+      <w:r>
+        <w:t xml:space="preserve"> com ou sem</w:t>
+      </w:r>
+      <w:r>
+        <w:t xml:space="preserve"> </w:t>
+      </w:r>
+      <w:r>
+        <w:t>atestado</w:t>
+      </w:r>
+      <w:r>
+        <w:t>s</w:t>
+      </w:r>
+      <w:r>
+        <w:t xml:space="preserve"> (como identificar um atraso?? Existe um cadastro de hora para entrada/ saída de cada colaborador?? aqui é necessário desenvolver uma lógica para pesquisar no próprio </w:t>
+      </w:r>
+      <w:proofErr w:type="spellStart"/>
+      <w:r>
+        <w:t>Kairos</w:t>
+      </w:r>
+      <w:proofErr w:type="spellEnd"/>
+      <w:r>
+        <w:t xml:space="preserve">, se existe alguma justificativa para a irresponsabilidade do </w:t>
+      </w:r>
+      <w:proofErr w:type="spellStart"/>
+      <w:r>
+        <w:t>colab</w:t>
+      </w:r>
+      <w:proofErr w:type="spellEnd"/>
+      <w:r>
+        <w:t>. Caso negativo, é simplesmente um atraso ou uma falta</w:t>
+      </w:r>
+      <w:r>
+        <w:t>. Ainda estudar como trazer essa informação para o/a responsável</w:t>
       </w:r>
       <w:r>
         <w:t>)</w:t>
       </w:r>
-      <w:r>
-        <w:t xml:space="preserve"> </w:t>
-      </w:r>
-    </w:p>
-    <w:p>
-      <w:pPr>
-        <w:pStyle w:val="PargrafodaLista"/>
-        <w:numPr>
-          <w:ilvl w:val="0"/>
-          <w:numId w:val="2"/>
-        </w:numPr>
-      </w:pPr>
-      <w:r>
-        <w:t xml:space="preserve">+ Data e Hora do batimento sem análise de segundos (estão separados por um ‘T’) </w:t>
-      </w:r>
-    </w:p>
-    <w:p>
-      <w:pPr>
-        <w:pStyle w:val="PargrafodaLista"/>
-        <w:numPr>
-          <w:ilvl w:val="0"/>
-          <w:numId w:val="2"/>
-        </w:numPr>
-      </w:pPr>
-      <w:r>
-        <w:t xml:space="preserve">+ ‘-’ </w:t>
-      </w:r>
-      <w:r>
-        <w:t>(hífen)</w:t>
-      </w:r>
-    </w:p>
-    <w:p>
-      <w:pPr>
-        <w:pStyle w:val="PargrafodaLista"/>
-        <w:numPr>
-          <w:ilvl w:val="0"/>
-          <w:numId w:val="2"/>
-        </w:numPr>
-      </w:pPr>
-      <w:r>
-        <w:t xml:space="preserve">+ ‘0300’ (ainda inexplicado) </w:t>
-      </w:r>
-    </w:p>
-    <w:p>
-      <w:pPr>
-        <w:pStyle w:val="PargrafodaLista"/>
-        <w:numPr>
-          <w:ilvl w:val="0"/>
-          <w:numId w:val="2"/>
-        </w:numPr>
-      </w:pPr>
-      <w:r>
-        <w:t>+ CPF do colab. (PJ</w:t>
-      </w:r>
-      <w:r>
-        <w:t xml:space="preserve"> não bate ponto</w:t>
-      </w:r>
-      <w:r>
-        <w:t xml:space="preserve">) </w:t>
-      </w:r>
-    </w:p>
-    <w:p>
-      <w:pPr>
-        <w:pStyle w:val="PargrafodaLista"/>
-        <w:numPr>
-          <w:ilvl w:val="0"/>
-          <w:numId w:val="2"/>
-        </w:numPr>
-      </w:pPr>
-      <w:r>
-        <w:t>+</w:t>
-      </w:r>
-      <w:r>
-        <w:t xml:space="preserve"> ‘ ’ (espaço em branco) </w:t>
-      </w:r>
-    </w:p>
-    <w:p>
-      <w:pPr>
-        <w:pStyle w:val="PargrafodaLista"/>
-        <w:numPr>
-          <w:ilvl w:val="0"/>
-          <w:numId w:val="2"/>
-        </w:numPr>
-      </w:pPr>
-      <w:r>
-        <w:t>+ A mesma Data e Hora do batimento acima, só que com a análise de segundos (também separados por ‘T’)</w:t>
-      </w:r>
-    </w:p>
-    <w:p>
-      <w:pPr>
-        <w:pStyle w:val="PargrafodaLista"/>
-        <w:numPr>
-          <w:ilvl w:val="0"/>
-          <w:numId w:val="2"/>
-        </w:numPr>
-      </w:pPr>
-      <w:r>
-        <w:t>+</w:t>
-      </w:r>
-      <w:r>
-        <w:t xml:space="preserve"> ‘-’ </w:t>
-      </w:r>
-    </w:p>
-    <w:p>
-      <w:pPr>
-        <w:pStyle w:val="PargrafodaLista"/>
-        <w:numPr>
-          <w:ilvl w:val="0"/>
-          <w:numId w:val="2"/>
-        </w:numPr>
-      </w:pPr>
-      <w:r>
-        <w:t xml:space="preserve">+ Um montante de 8 caracteres (ainda inexplicado, porém com um determinado padrão. Nos exemplos temos: </w:t>
-      </w:r>
-      <w:r>
-        <w:t>03000503</w:t>
-      </w:r>
-      <w:r>
-        <w:t xml:space="preserve"> e </w:t>
-      </w:r>
-      <w:r>
-        <w:t>0300050</w:t>
-      </w:r>
-      <w:r>
-        <w:t xml:space="preserve">a, mas já foi analisado outros </w:t>
-      </w:r>
+    </w:p>
+    <w:p/>
+    <w:p>
+      <w:r>
+        <w:t xml:space="preserve">* Eu pensei em: além de baixar todos os arquivos necessários por mês de cada colaborador e </w:t>
+      </w:r>
+      <w:proofErr w:type="gramStart"/>
+      <w:r>
+        <w:t>coloca-los</w:t>
+      </w:r>
+      <w:proofErr w:type="gramEnd"/>
+      <w:r>
+        <w:t xml:space="preserve"> na pasta de leitura do </w:t>
+      </w:r>
+      <w:proofErr w:type="spellStart"/>
+      <w:r>
+        <w:t>Cigam</w:t>
+      </w:r>
+      <w:proofErr w:type="spellEnd"/>
+      <w:r>
+        <w:t>, criar um documento ‘</w:t>
+      </w:r>
+      <w:proofErr w:type="spellStart"/>
+      <w:r>
+        <w:t>xlsx</w:t>
+      </w:r>
+      <w:proofErr w:type="spellEnd"/>
+      <w:r>
+        <w:t>’ para cada ativo (colaborador com seu ponto e falta, justificativa ou falta em um determinado período) e salvar em outro local. Assim, quando o/a responsável identificar alguma irresponsabilidade pela parte do colaborador, consiga encontrar de forma rápida e centralizada o motivo.</w:t>
+      </w:r>
+    </w:p>
+    <w:p/>
+    <w:p>
+      <w:r>
+        <w:t xml:space="preserve">LUCAS = “TENTA EM PEGAR OS MESES PASSADOS E IMPLEMENTAR NO </w:t>
+      </w:r>
+      <w:r>
+        <w:t>CIGAM</w:t>
+      </w:r>
+      <w:r>
+        <w:t>, FOCA NISSO.</w:t>
+      </w:r>
+    </w:p>
+    <w:p/>
+    <w:p>
       <w:r>
         <w:lastRenderedPageBreak/>
-        <w:t>códigos:</w:t>
-      </w:r>
-      <w:r>
-        <w:t xml:space="preserve"> </w:t>
-      </w:r>
-      <w:r>
-        <w:t>0300020d, 03000200, 03000206, 03000201, 03000205, 03000202, 03000208, 0300020c, 03000204, 03000207):</w:t>
-      </w:r>
-    </w:p>
-    <w:p>
-      <w:pPr>
-        <w:pStyle w:val="PargrafodaLista"/>
-        <w:numPr>
-          <w:ilvl w:val="1"/>
-          <w:numId w:val="2"/>
-        </w:numPr>
-      </w:pPr>
-      <w:r>
-        <w:rPr>
-          <w:i/>
-          <w:iCs/>
-        </w:rPr>
-        <w:t>Minha humilde opinião é que o “03” significa algo, ‘0002’ ou ‘0005’ significam outra coisa e por final, ‘0a’, ‘03’, ‘0c’...significam outra coisa.</w:t>
-      </w:r>
-    </w:p>
-    <w:p>
-      <w:pPr>
-        <w:pStyle w:val="PargrafodaLista"/>
-        <w:numPr>
-          <w:ilvl w:val="0"/>
-          <w:numId w:val="2"/>
-        </w:numPr>
-      </w:pPr>
-      <w:r>
-        <w:t>+ Código aleatório (ainda inexplicado)</w:t>
-      </w:r>
-    </w:p>
-    <w:p/>
-    <w:p>
-      <w:r>
-        <w:t xml:space="preserve">PROBLEMÁTICA: Há um processo interno e manual de entrar no Kairós e baixar </w:t>
-      </w:r>
-      <w:r>
-        <w:t>o arquivo</w:t>
-      </w:r>
-      <w:r>
-        <w:t xml:space="preserve"> </w:t>
-      </w:r>
-      <w:r>
-        <w:t>dentre um “De-Até”, colocá-lo dentro de uma pasta específica onde o Cigam consiga ler. Após essa integração dos dados, o/a responsável tem que entrar no Cigam, verificar os dias em que a integração não foi concluída com sucesso (caso seja verificada a necessidade), voltar no Kairos e identificar se possui alguma justificativa</w:t>
-      </w:r>
-      <w:r>
-        <w:t xml:space="preserve"> ou se foi apenas um atraso/irresponsabilidade do colaborador</w:t>
-      </w:r>
-      <w:r>
-        <w:t xml:space="preserve">. Caso haja, o/a responsável volta no Cigam e </w:t>
-      </w:r>
-      <w:r>
-        <w:t>ajusta algo (até o momento, a ação é desconhecida).</w:t>
-      </w:r>
-    </w:p>
-    <w:p/>
-    <w:p>
-      <w:r>
-        <w:t xml:space="preserve">- aqui </w:t>
-      </w:r>
-      <w:r>
-        <w:t>fica evidente que uma automação completa levaria um tempo considerável, então vamos em parte, e a primeira é a implantação no Cigam de forma automática:</w:t>
-      </w:r>
-    </w:p>
-    <w:p>
-      <w:r>
-        <w:t xml:space="preserve"> </w:t>
-      </w:r>
-    </w:p>
-    <w:p>
-      <w:r>
-        <w:t>* A</w:t>
-      </w:r>
-      <w:r>
-        <w:t xml:space="preserve"> gente tem que pegar o ponto de cada </w:t>
-      </w:r>
-      <w:r>
-        <w:t xml:space="preserve">empresa </w:t>
-      </w:r>
-      <w:r>
-        <w:t xml:space="preserve">(verificar se </w:t>
-      </w:r>
-      <w:r>
-        <w:t>existe algum ‘</w:t>
-      </w:r>
-      <w:r>
-        <w:t>ativo</w:t>
-      </w:r>
-      <w:r>
-        <w:t>’</w:t>
-      </w:r>
-      <w:r>
-        <w:t>, i</w:t>
-      </w:r>
-      <w:r>
-        <w:t>sso existe??) e buscar se em determinado dia a pessoa teve algum atraso</w:t>
-      </w:r>
-      <w:r>
-        <w:t xml:space="preserve"> (lembrar dos 10min depois de bater o ponto de entrada e depois da volta do almoço),</w:t>
-      </w:r>
-      <w:r>
-        <w:t xml:space="preserve"> justificativa e</w:t>
-      </w:r>
-      <w:r>
-        <w:t>/ou</w:t>
-      </w:r>
-      <w:r>
-        <w:t xml:space="preserve"> faltas</w:t>
-      </w:r>
-      <w:r>
-        <w:t xml:space="preserve"> com ou sem</w:t>
-      </w:r>
-      <w:r>
-        <w:t xml:space="preserve"> </w:t>
-      </w:r>
-      <w:r>
-        <w:t>atestado</w:t>
-      </w:r>
-      <w:r>
-        <w:t>s</w:t>
-      </w:r>
-      <w:r>
-        <w:t xml:space="preserve"> (como identificar um atraso?? Existe um cadastro de hora para entrada/ saída de cada colaborador?? aqui é necessário desenvolver uma lógica para pesquisar no próprio Kairos, se existe alguma justificativa para a irresponsabilidade do colab. Caso negativo, é simplesmente um atraso ou uma falta</w:t>
-      </w:r>
-      <w:r>
-        <w:t>. Ainda estudar como trazer essa informação para o/a responsável</w:t>
-      </w:r>
-      <w:r>
-        <w:t>)</w:t>
-      </w:r>
-    </w:p>
-    <w:p/>
-    <w:p>
-      <w:r>
-        <w:t>* Eu pensei em: além de baixar todos os arquivos necessários por mês de cada colaborador e coloca-los na pasta de leitura do Cigam, criar um documento ‘xlsx’ para cada ativo (colaborador com seu ponto e falta, justificativa ou falta em um determinado período) e salvar em outro local. Assim, quando o/a responsável identificar alguma irresponsabilidade pela parte do colaborador, consiga encontrar de forma rápida e centralizada o motivo.</w:t>
-      </w:r>
-    </w:p>
-    <w:p/>
-    <w:p>
-      <w:r>
-        <w:t xml:space="preserve">LUCAS = “TENTA EM PEGAR OS MESES PASSADOS E IMPLEMENTAR NO </w:t>
-      </w:r>
-      <w:r>
-        <w:t>CIGAM</w:t>
-      </w:r>
-      <w:r>
-        <w:t>, FOCA NISSO.</w:t>
-      </w:r>
-    </w:p>
-    <w:p/>
-    <w:p>
-      <w:r>
         <w:t>BUSCAR TODAS AS MARCAÇÕES DE UM DETERMINADO PERÍODO DE CADA FUNCIONÁRIO,</w:t>
       </w:r>
       <w:r>
@@ -564,7 +675,6 @@
     </w:p>
     <w:p>
       <w:r>
-        <w:lastRenderedPageBreak/>
         <w:t>MEU ID: 1703</w:t>
       </w:r>
     </w:p>

</xml_diff>